<commit_message>
updated changes 17th july
</commit_message>
<xml_diff>
--- a/202441750_Dipanjan_Das_project_proposal.docx
+++ b/202441750_Dipanjan_Das_project_proposal.docx
@@ -1240,7 +1240,23 @@
                 <w:rFonts w:cstheme="minorHAnsi"/>
                 <w:bCs/>
               </w:rPr>
-              <w:t>: The project uses the CropNet Benchmark (2023), a standard public collection of agricultural data</w:t>
+              <w:t xml:space="preserve">: The project uses the </w:t>
+            </w:r>
+            <w:proofErr w:type="spellStart"/>
+            <w:r>
+              <w:rPr>
+                <w:rFonts w:cstheme="minorHAnsi"/>
+                <w:bCs/>
+              </w:rPr>
+              <w:t>CropNet</w:t>
+            </w:r>
+            <w:proofErr w:type="spellEnd"/>
+            <w:r>
+              <w:rPr>
+                <w:rFonts w:cstheme="minorHAnsi"/>
+                <w:bCs/>
+              </w:rPr>
+              <w:t xml:space="preserve"> Benchmark (2023), a standard public collection of agricultural data</w:t>
             </w:r>
             <w:r>
               <w:rPr>
@@ -2336,7 +2352,23 @@
                 <w:rFonts w:cstheme="minorHAnsi"/>
                 <w:bCs/>
               </w:rPr>
-              <w:t>Pattern Recognition: Using standard computer vision (CNNs) to analyze the video of crop growth.</w:t>
+              <w:t xml:space="preserve">Pattern Recognition: Using standard computer vision (CNNs) to </w:t>
+            </w:r>
+            <w:proofErr w:type="spellStart"/>
+            <w:r>
+              <w:rPr>
+                <w:rFonts w:cstheme="minorHAnsi"/>
+                <w:bCs/>
+              </w:rPr>
+              <w:t>analyze</w:t>
+            </w:r>
+            <w:proofErr w:type="spellEnd"/>
+            <w:r>
+              <w:rPr>
+                <w:rFonts w:cstheme="minorHAnsi"/>
+                <w:bCs/>
+              </w:rPr>
+              <w:t xml:space="preserve"> the video of crop growth.</w:t>
             </w:r>
           </w:p>
           <w:p>
@@ -2420,7 +2452,23 @@
                 <w:rFonts w:cstheme="minorHAnsi"/>
                 <w:bCs/>
               </w:rPr>
-              <w:t>with Jupyter Notebook</w:t>
+              <w:t xml:space="preserve">with </w:t>
+            </w:r>
+            <w:proofErr w:type="spellStart"/>
+            <w:r>
+              <w:rPr>
+                <w:rFonts w:cstheme="minorHAnsi"/>
+                <w:bCs/>
+              </w:rPr>
+              <w:t>Jupyter</w:t>
+            </w:r>
+            <w:proofErr w:type="spellEnd"/>
+            <w:r>
+              <w:rPr>
+                <w:rFonts w:cstheme="minorHAnsi"/>
+                <w:bCs/>
+              </w:rPr>
+              <w:t xml:space="preserve"> Notebook</w:t>
             </w:r>
             <w:r>
               <w:rPr>
@@ -2464,12 +2512,21 @@
                 <w:bCs/>
               </w:rPr>
             </w:pPr>
-            <w:r>
-              <w:rPr>
-                <w:rFonts w:cstheme="minorHAnsi"/>
-                <w:bCs/>
-              </w:rPr>
-              <w:t>PyTorch (for building the model structure)</w:t>
+            <w:proofErr w:type="spellStart"/>
+            <w:r>
+              <w:rPr>
+                <w:rFonts w:cstheme="minorHAnsi"/>
+                <w:bCs/>
+              </w:rPr>
+              <w:t>PyTorch</w:t>
+            </w:r>
+            <w:proofErr w:type="spellEnd"/>
+            <w:r>
+              <w:rPr>
+                <w:rFonts w:cstheme="minorHAnsi"/>
+                <w:bCs/>
+              </w:rPr>
+              <w:t xml:space="preserve"> (for building the model structure)</w:t>
             </w:r>
           </w:p>
           <w:p>
@@ -2484,12 +2541,21 @@
                 <w:bCs/>
               </w:rPr>
             </w:pPr>
-            <w:r>
-              <w:rPr>
-                <w:rFonts w:cstheme="minorHAnsi"/>
-                <w:bCs/>
-              </w:rPr>
-              <w:t xml:space="preserve">Numpy, </w:t>
+            <w:proofErr w:type="spellStart"/>
+            <w:r>
+              <w:rPr>
+                <w:rFonts w:cstheme="minorHAnsi"/>
+                <w:bCs/>
+              </w:rPr>
+              <w:t>Numpy</w:t>
+            </w:r>
+            <w:proofErr w:type="spellEnd"/>
+            <w:r>
+              <w:rPr>
+                <w:rFonts w:cstheme="minorHAnsi"/>
+                <w:bCs/>
+              </w:rPr>
+              <w:t xml:space="preserve">, </w:t>
             </w:r>
             <w:r>
               <w:rPr>
@@ -2503,7 +2569,39 @@
                 <w:rFonts w:cstheme="minorHAnsi"/>
                 <w:bCs/>
               </w:rPr>
-              <w:t>pandas, sklearn, scipy for data preprocessing</w:t>
+              <w:t xml:space="preserve">pandas, </w:t>
+            </w:r>
+            <w:proofErr w:type="spellStart"/>
+            <w:r>
+              <w:rPr>
+                <w:rFonts w:cstheme="minorHAnsi"/>
+                <w:bCs/>
+              </w:rPr>
+              <w:t>sklearn</w:t>
+            </w:r>
+            <w:proofErr w:type="spellEnd"/>
+            <w:r>
+              <w:rPr>
+                <w:rFonts w:cstheme="minorHAnsi"/>
+                <w:bCs/>
+              </w:rPr>
+              <w:t xml:space="preserve">, </w:t>
+            </w:r>
+            <w:proofErr w:type="spellStart"/>
+            <w:r>
+              <w:rPr>
+                <w:rFonts w:cstheme="minorHAnsi"/>
+                <w:bCs/>
+              </w:rPr>
+              <w:t>scipy</w:t>
+            </w:r>
+            <w:proofErr w:type="spellEnd"/>
+            <w:r>
+              <w:rPr>
+                <w:rFonts w:cstheme="minorHAnsi"/>
+                <w:bCs/>
+              </w:rPr>
+              <w:t xml:space="preserve"> for data preprocessing</w:t>
             </w:r>
           </w:p>
           <w:p>
@@ -2899,6 +2997,7 @@
               </w:rPr>
               <w:t xml:space="preserve"> </w:t>
             </w:r>
+            <w:proofErr w:type="spellStart"/>
             <w:r>
               <w:rPr>
                 <w:rFonts w:asciiTheme="minorHAnsi" w:hAnsiTheme="minorHAnsi" w:cstheme="minorHAnsi"/>
@@ -2907,8 +3006,9 @@
                 <w:sz w:val="22"/>
                 <w:szCs w:val="22"/>
               </w:rPr>
-              <w:t xml:space="preserve">CropNet: A Large-Scale Crop Yield Prediction Benchmark. </w:t>
-            </w:r>
+              <w:t>CropNet</w:t>
+            </w:r>
+            <w:proofErr w:type="spellEnd"/>
             <w:r>
               <w:rPr>
                 <w:rFonts w:asciiTheme="minorHAnsi" w:hAnsiTheme="minorHAnsi" w:cstheme="minorHAnsi"/>
@@ -2917,7 +3017,7 @@
                 <w:sz w:val="22"/>
                 <w:szCs w:val="22"/>
               </w:rPr>
-              <w:t>It</w:t>
+              <w:t xml:space="preserve">: A Large-Scale Crop Yield Prediction Benchmark. </w:t>
             </w:r>
             <w:r>
               <w:rPr>
@@ -2927,7 +3027,7 @@
                 <w:sz w:val="22"/>
                 <w:szCs w:val="22"/>
               </w:rPr>
-              <w:t xml:space="preserve"> </w:t>
+              <w:t>It</w:t>
             </w:r>
             <w:r>
               <w:rPr>
@@ -2937,7 +3037,7 @@
                 <w:sz w:val="22"/>
                 <w:szCs w:val="22"/>
               </w:rPr>
-              <w:t>p</w:t>
+              <w:t xml:space="preserve"> </w:t>
             </w:r>
             <w:r>
               <w:rPr>
@@ -2947,7 +3047,7 @@
                 <w:sz w:val="22"/>
                 <w:szCs w:val="22"/>
               </w:rPr>
-              <w:t xml:space="preserve">rovides the state-of-the-art benchmark </w:t>
+              <w:t>p</w:t>
             </w:r>
             <w:r>
               <w:rPr>
@@ -2957,7 +3057,7 @@
                 <w:sz w:val="22"/>
                 <w:szCs w:val="22"/>
               </w:rPr>
-              <w:t xml:space="preserve">giving </w:t>
+              <w:t xml:space="preserve">rovides the state-of-the-art benchmark </w:t>
             </w:r>
             <w:r>
               <w:rPr>
@@ -2967,7 +3067,7 @@
                 <w:sz w:val="22"/>
                 <w:szCs w:val="22"/>
               </w:rPr>
-              <w:t xml:space="preserve">spatiotemporal satellite tensors with meteorological </w:t>
+              <w:t xml:space="preserve">giving </w:t>
             </w:r>
             <w:r>
               <w:rPr>
@@ -2977,7 +3077,7 @@
                 <w:sz w:val="22"/>
                 <w:szCs w:val="22"/>
               </w:rPr>
-              <w:t>data</w:t>
+              <w:t xml:space="preserve">spatiotemporal satellite tensors with meteorological </w:t>
             </w:r>
             <w:r>
               <w:rPr>
@@ -2987,7 +3087,7 @@
                 <w:sz w:val="22"/>
                 <w:szCs w:val="22"/>
               </w:rPr>
-              <w:t xml:space="preserve"> across diverse geographies than any single-source baseline</w:t>
+              <w:t>data</w:t>
             </w:r>
             <w:r>
               <w:rPr>
@@ -2997,7 +3097,7 @@
                 <w:sz w:val="22"/>
                 <w:szCs w:val="22"/>
               </w:rPr>
-              <w:t xml:space="preserve"> helps in crop yield prediction for deep learning networks</w:t>
+              <w:t xml:space="preserve"> across diverse geographies than any single-source baseline</w:t>
             </w:r>
             <w:r>
               <w:rPr>
@@ -3007,13 +3107,9 @@
                 <w:sz w:val="22"/>
                 <w:szCs w:val="22"/>
               </w:rPr>
-              <w:t>.</w:t>
-            </w:r>
-          </w:p>
-          <w:p>
-            <w:pPr>
-              <w:pStyle w:val="Default"/>
-              <w:spacing w:after="86"/>
+              <w:t xml:space="preserve"> helps in crop yield prediction for deep learning networks</w:t>
+            </w:r>
+            <w:r>
               <w:rPr>
                 <w:rFonts w:asciiTheme="minorHAnsi" w:hAnsiTheme="minorHAnsi" w:cstheme="minorHAnsi"/>
                 <w:bCs/>
@@ -3021,8 +3117,13 @@
                 <w:sz w:val="22"/>
                 <w:szCs w:val="22"/>
               </w:rPr>
-            </w:pPr>
-            <w:r>
+              <w:t>.</w:t>
+            </w:r>
+          </w:p>
+          <w:p>
+            <w:pPr>
+              <w:pStyle w:val="Default"/>
+              <w:spacing w:after="86"/>
               <w:rPr>
                 <w:rFonts w:asciiTheme="minorHAnsi" w:hAnsiTheme="minorHAnsi" w:cstheme="minorHAnsi"/>
                 <w:bCs/>
@@ -3030,7 +3131,38 @@
                 <w:sz w:val="22"/>
                 <w:szCs w:val="22"/>
               </w:rPr>
-              <w:t>More recent research, such as Maimaitijiang, M. et al. (2020), empirically demonstrated that combining spectral and thermal UAV data improves yield prediction accuracy compared to single-sensor approaches. This provides direct evidence that multimodal fusion enhances predictive robustness.</w:t>
+            </w:pPr>
+            <w:r>
+              <w:rPr>
+                <w:rFonts w:asciiTheme="minorHAnsi" w:hAnsiTheme="minorHAnsi" w:cstheme="minorHAnsi"/>
+                <w:bCs/>
+                <w:color w:val="auto"/>
+                <w:sz w:val="22"/>
+                <w:szCs w:val="22"/>
+              </w:rPr>
+              <w:t xml:space="preserve">More recent research, such as </w:t>
+            </w:r>
+            <w:proofErr w:type="spellStart"/>
+            <w:r>
+              <w:rPr>
+                <w:rFonts w:asciiTheme="minorHAnsi" w:hAnsiTheme="minorHAnsi" w:cstheme="minorHAnsi"/>
+                <w:bCs/>
+                <w:color w:val="auto"/>
+                <w:sz w:val="22"/>
+                <w:szCs w:val="22"/>
+              </w:rPr>
+              <w:t>Maimaitijiang</w:t>
+            </w:r>
+            <w:proofErr w:type="spellEnd"/>
+            <w:r>
+              <w:rPr>
+                <w:rFonts w:asciiTheme="minorHAnsi" w:hAnsiTheme="minorHAnsi" w:cstheme="minorHAnsi"/>
+                <w:bCs/>
+                <w:color w:val="auto"/>
+                <w:sz w:val="22"/>
+                <w:szCs w:val="22"/>
+              </w:rPr>
+              <w:t>, M. et al. (2020), empirically demonstrated that combining spectral and thermal UAV data improves yield prediction accuracy compared to single-sensor approaches. This provides direct evidence that multimodal fusion enhances predictive robustness.</w:t>
             </w:r>
           </w:p>
           <w:p>
@@ -3210,6 +3342,7 @@
                 <w:szCs w:val="22"/>
               </w:rPr>
             </w:pPr>
+            <w:proofErr w:type="spellStart"/>
             <w:r>
               <w:rPr>
                 <w:rFonts w:asciiTheme="minorHAnsi" w:hAnsiTheme="minorHAnsi" w:cstheme="minorHAnsi"/>
@@ -3218,7 +3351,18 @@
                 <w:sz w:val="22"/>
                 <w:szCs w:val="22"/>
               </w:rPr>
-              <w:t>Maimaitijiang, M., et al. (2020). Soybean yield prediction from UAV using multimodal data fusion</w:t>
+              <w:t>Maimaitijiang</w:t>
+            </w:r>
+            <w:proofErr w:type="spellEnd"/>
+            <w:r>
+              <w:rPr>
+                <w:rFonts w:asciiTheme="minorHAnsi" w:hAnsiTheme="minorHAnsi" w:cstheme="minorHAnsi"/>
+                <w:bCs/>
+                <w:color w:val="auto"/>
+                <w:sz w:val="22"/>
+                <w:szCs w:val="22"/>
+              </w:rPr>
+              <w:t>, M., et al. (2020). Soybean yield prediction from UAV using multimodal data fusion</w:t>
             </w:r>
             <w:r>
               <w:rPr>
@@ -4127,13 +4271,7 @@
                     <w:rPr>
                       <w:rFonts w:cstheme="minorHAnsi"/>
                     </w:rPr>
-                    <w:t xml:space="preserve"> </w:t>
-                  </w:r>
-                  <w:r>
-                    <w:rPr>
-                      <w:rFonts w:cstheme="minorHAnsi"/>
-                    </w:rPr>
-                    <w:t>and doing hyper parameter tuning</w:t>
+                    <w:t xml:space="preserve"> and doing hyper parameter tuning</w:t>
                   </w:r>
                   <w:r>
                     <w:rPr>
@@ -4495,11 +4633,19 @@
                 <w:rFonts w:cstheme="minorHAnsi"/>
               </w:rPr>
             </w:pPr>
-            <w:r>
-              <w:rPr>
-                <w:rFonts w:cstheme="minorHAnsi"/>
-              </w:rPr>
-              <w:t>PyTorch Documentation (</w:t>
+            <w:proofErr w:type="spellStart"/>
+            <w:r>
+              <w:rPr>
+                <w:rFonts w:cstheme="minorHAnsi"/>
+              </w:rPr>
+              <w:t>PyTorch</w:t>
+            </w:r>
+            <w:proofErr w:type="spellEnd"/>
+            <w:r>
+              <w:rPr>
+                <w:rFonts w:cstheme="minorHAnsi"/>
+              </w:rPr>
+              <w:t xml:space="preserve"> Documentation (</w:t>
             </w:r>
             <w:hyperlink r:id="rId14" w:history="1">
               <w:r>
@@ -4528,11 +4674,33 @@
                 <w:rFonts w:cstheme="minorHAnsi"/>
               </w:rPr>
             </w:pPr>
-            <w:r>
-              <w:rPr>
-                <w:rFonts w:cstheme="minorHAnsi"/>
-              </w:rPr>
-              <w:t>RasterIO/Geopandas (</w:t>
+            <w:proofErr w:type="spellStart"/>
+            <w:r>
+              <w:rPr>
+                <w:rFonts w:cstheme="minorHAnsi"/>
+              </w:rPr>
+              <w:t>RasterIO</w:t>
+            </w:r>
+            <w:proofErr w:type="spellEnd"/>
+            <w:r>
+              <w:rPr>
+                <w:rFonts w:cstheme="minorHAnsi"/>
+              </w:rPr>
+              <w:t>/</w:t>
+            </w:r>
+            <w:proofErr w:type="spellStart"/>
+            <w:r>
+              <w:rPr>
+                <w:rFonts w:cstheme="minorHAnsi"/>
+              </w:rPr>
+              <w:t>Geopandas</w:t>
+            </w:r>
+            <w:proofErr w:type="spellEnd"/>
+            <w:r>
+              <w:rPr>
+                <w:rFonts w:cstheme="minorHAnsi"/>
+              </w:rPr>
+              <w:t xml:space="preserve"> (</w:t>
             </w:r>
             <w:hyperlink r:id="rId15" w:history="1">
               <w:r>
@@ -4615,11 +4783,19 @@
                 <w:rFonts w:cstheme="minorHAnsi"/>
               </w:rPr>
             </w:pPr>
-            <w:r>
-              <w:rPr>
-                <w:rFonts w:cstheme="minorHAnsi"/>
-              </w:rPr>
-              <w:t>CropNet Dataset Documentation (</w:t>
+            <w:proofErr w:type="spellStart"/>
+            <w:r>
+              <w:rPr>
+                <w:rFonts w:cstheme="minorHAnsi"/>
+              </w:rPr>
+              <w:t>CropNet</w:t>
+            </w:r>
+            <w:proofErr w:type="spellEnd"/>
+            <w:r>
+              <w:rPr>
+                <w:rFonts w:cstheme="minorHAnsi"/>
+              </w:rPr>
+              <w:t xml:space="preserve"> Dataset Documentation (</w:t>
             </w:r>
             <w:hyperlink r:id="rId18" w:history="1">
               <w:r>
@@ -5038,7 +5214,21 @@
               <w:rPr>
                 <w:rFonts w:cstheme="minorHAnsi"/>
               </w:rPr>
-              <w:t>Lag Analysis: Analyze how weather events in the spring (e.g., heavy rainfall) impact the vegetation health (NDVI) measured weeks later in the summer.</w:t>
+              <w:t xml:space="preserve">Lag Analysis: </w:t>
+            </w:r>
+            <w:proofErr w:type="spellStart"/>
+            <w:r>
+              <w:rPr>
+                <w:rFonts w:cstheme="minorHAnsi"/>
+              </w:rPr>
+              <w:t>Analyze</w:t>
+            </w:r>
+            <w:proofErr w:type="spellEnd"/>
+            <w:r>
+              <w:rPr>
+                <w:rFonts w:cstheme="minorHAnsi"/>
+              </w:rPr>
+              <w:t xml:space="preserve"> how weather events in the spring (e.g., heavy rainfall) impact the vegetation health (NDVI) measured weeks later in the summer.</w:t>
             </w:r>
           </w:p>
           <w:p>
@@ -5309,7 +5499,23 @@
                 <w:rFonts w:cstheme="minorHAnsi"/>
                 <w:bCs/>
               </w:rPr>
-              <w:t>modular PyTorch implementation of the GMU architecture, released as an open-source library.</w:t>
+              <w:t xml:space="preserve">modular </w:t>
+            </w:r>
+            <w:proofErr w:type="spellStart"/>
+            <w:r>
+              <w:rPr>
+                <w:rFonts w:cstheme="minorHAnsi"/>
+                <w:bCs/>
+              </w:rPr>
+              <w:t>PyTorch</w:t>
+            </w:r>
+            <w:proofErr w:type="spellEnd"/>
+            <w:r>
+              <w:rPr>
+                <w:rFonts w:cstheme="minorHAnsi"/>
+                <w:bCs/>
+              </w:rPr>
+              <w:t xml:space="preserve"> implementation of the GMU architecture, released as an open-source library.</w:t>
             </w:r>
           </w:p>
         </w:tc>
@@ -5610,6 +5816,22 @@
           <w:szCs w:val="24"/>
         </w:rPr>
       </w:pPr>
+    </w:p>
+    <w:p>
+      <w:pPr>
+        <w:spacing w:after="0" w:line="240" w:lineRule="auto"/>
+        <w:rPr>
+          <w:sz w:val="24"/>
+          <w:szCs w:val="24"/>
+        </w:rPr>
+      </w:pPr>
+      <w:r>
+        <w:rPr>
+          <w:sz w:val="24"/>
+          <w:szCs w:val="24"/>
+        </w:rPr>
+        <w:t>https://en.wikipedia.org/wiki/List_of_geographic_centers_of_the_United_States#:~:text=Illinois%2C%2028.8%20mi%20(46.3%20km)%20northeast%20of,40%C2%B002%E2%80%B230%E2%80%B3N%2089%C2%B011%E2%80%B247%E2%80%B3W%EF%BB%BF%20/%20%EF%BB%BF40.0417%C2%B0N%2089.1965%C2%B0W%EF%BB%BF%20/%2040.0417;</w:t>
+      </w:r>
     </w:p>
     <w:sectPr>
       <w:headerReference w:type="default" r:id="rId20"/>
@@ -10202,6 +10424,17 @@
 </file>
 
 <file path=customXml/item1.xml><?xml version="1.0" encoding="utf-8"?>
+<p:properties xmlns:p="http://schemas.microsoft.com/office/2006/metadata/properties" xmlns:xsi="http://www.w3.org/2001/XMLSchema-instance" xmlns:pc="http://schemas.microsoft.com/office/infopath/2007/PartnerControls">
+  <documentManagement>
+    <lcf76f155ced4ddcb4097134ff3c332f xmlns="fa9a92f5-3260-477f-a58f-f3a51e1f64a6">
+      <Terms xmlns="http://schemas.microsoft.com/office/infopath/2007/PartnerControls"/>
+    </lcf76f155ced4ddcb4097134ff3c332f>
+    <TaxCatchAll xmlns="51d2575b-eaba-46cb-a498-d84e13c08828" xsi:nil="true"/>
+  </documentManagement>
+</p:properties>
+</file>
+
+<file path=customXml/item2.xml><?xml version="1.0" encoding="utf-8"?>
 <ct:contentTypeSchema xmlns:ct="http://schemas.microsoft.com/office/2006/metadata/contentType" xmlns:ma="http://schemas.microsoft.com/office/2006/metadata/properties/metaAttributes" ct:_="" ma:_="" ma:contentTypeName="Document" ma:contentTypeID="0x010100A0780F3B1C560649B8E6F9D43481E145" ma:contentTypeVersion="15" ma:contentTypeDescription="Create a new document." ma:contentTypeScope="" ma:versionID="c8c10bceb6db1e88d07465ba25c40fea">
   <xsd:schema xmlns:xsd="http://www.w3.org/2001/XMLSchema" xmlns:xs="http://www.w3.org/2001/XMLSchema" xmlns:p="http://schemas.microsoft.com/office/2006/metadata/properties" xmlns:ns2="fa9a92f5-3260-477f-a58f-f3a51e1f64a6" xmlns:ns3="51d2575b-eaba-46cb-a498-d84e13c08828" targetNamespace="http://schemas.microsoft.com/office/2006/metadata/properties" ma:root="true" ma:fieldsID="d5cc72a9d3190babe5ffe13bcc6788df" ns2:_="" ns3:_="">
     <xsd:import namespace="fa9a92f5-3260-477f-a58f-f3a51e1f64a6"/>
@@ -10438,17 +10671,6 @@
 </ct:contentTypeSchema>
 </file>
 
-<file path=customXml/item2.xml><?xml version="1.0" encoding="utf-8"?>
-<p:properties xmlns:p="http://schemas.microsoft.com/office/2006/metadata/properties" xmlns:xsi="http://www.w3.org/2001/XMLSchema-instance" xmlns:pc="http://schemas.microsoft.com/office/infopath/2007/PartnerControls">
-  <documentManagement>
-    <lcf76f155ced4ddcb4097134ff3c332f xmlns="fa9a92f5-3260-477f-a58f-f3a51e1f64a6">
-      <Terms xmlns="http://schemas.microsoft.com/office/infopath/2007/PartnerControls"/>
-    </lcf76f155ced4ddcb4097134ff3c332f>
-    <TaxCatchAll xmlns="51d2575b-eaba-46cb-a498-d84e13c08828" xsi:nil="true"/>
-  </documentManagement>
-</p:properties>
-</file>
-
 <file path=customXml/item3.xml><?xml version="1.0" encoding="utf-8"?>
 <?mso-contentType ?>
 <FormTemplates xmlns="http://schemas.microsoft.com/sharepoint/v3/contenttype/forms">
@@ -10459,6 +10681,17 @@
 </file>
 
 <file path=customXml/itemProps1.xml><?xml version="1.0" encoding="utf-8"?>
+<ds:datastoreItem xmlns:ds="http://schemas.openxmlformats.org/officeDocument/2006/customXml" ds:itemID="{7AE28FAD-2F18-44BF-89A5-4F3BE3433A3E}">
+  <ds:schemaRefs>
+    <ds:schemaRef ds:uri="http://schemas.microsoft.com/office/2006/metadata/properties"/>
+    <ds:schemaRef ds:uri="http://schemas.microsoft.com/office/infopath/2007/PartnerControls"/>
+    <ds:schemaRef ds:uri="fa9a92f5-3260-477f-a58f-f3a51e1f64a6"/>
+    <ds:schemaRef ds:uri="51d2575b-eaba-46cb-a498-d84e13c08828"/>
+  </ds:schemaRefs>
+</ds:datastoreItem>
+</file>
+
+<file path=customXml/itemProps2.xml><?xml version="1.0" encoding="utf-8"?>
 <ds:datastoreItem xmlns:ds="http://schemas.openxmlformats.org/officeDocument/2006/customXml" ds:itemID="{E667F5C2-1B8D-4D7E-BFC8-9EAF85E480FC}">
   <ds:schemaRefs>
     <ds:schemaRef ds:uri="http://schemas.microsoft.com/office/2006/metadata/contentType"/>
@@ -10477,17 +10710,6 @@
 </ds:datastoreItem>
 </file>
 
-<file path=customXml/itemProps2.xml><?xml version="1.0" encoding="utf-8"?>
-<ds:datastoreItem xmlns:ds="http://schemas.openxmlformats.org/officeDocument/2006/customXml" ds:itemID="{7AE28FAD-2F18-44BF-89A5-4F3BE3433A3E}">
-  <ds:schemaRefs>
-    <ds:schemaRef ds:uri="http://schemas.microsoft.com/office/2006/metadata/properties"/>
-    <ds:schemaRef ds:uri="http://schemas.microsoft.com/office/infopath/2007/PartnerControls"/>
-    <ds:schemaRef ds:uri="fa9a92f5-3260-477f-a58f-f3a51e1f64a6"/>
-    <ds:schemaRef ds:uri="51d2575b-eaba-46cb-a498-d84e13c08828"/>
-  </ds:schemaRefs>
-</ds:datastoreItem>
-</file>
-
 <file path=customXml/itemProps3.xml><?xml version="1.0" encoding="utf-8"?>
 <ds:datastoreItem xmlns:ds="http://schemas.openxmlformats.org/officeDocument/2006/customXml" ds:itemID="{00F20754-9647-48FF-8C02-199877B05B77}">
   <ds:schemaRefs>

</xml_diff>